<commit_message>
Pacote de especificação 2.0 (constituição 2.0.0, feature 002) e modelo de contrato comercial v2
Co-Authored-By: Claude Opus 5.5 <noreply@anthropic.com>
Claude-Session: https://claude.ai/code/session_01P8GshrfUVPh258oJTKUDbp
</commit_message>
<xml_diff>
--- a/public/modelos/comercial.docx
+++ b/public/modelos/comercial.docx
@@ -76,7 +76,7 @@
           <w:sz w:val="19"/>
           <w:szCs w:val="19"/>
         </w:rPr>
-        <w:t xml:space="preserve">Para empresas que atendem o perfil de cliente da Wise Makers · Níveis Select, Premium e Elite</w:t>
+        <w:t xml:space="preserve">Para empresas que atendem o perfil de cliente da Wise Makers · Níveis Select, Premium e Elite · Versão 2</w:t>
       </w:r>
     </w:p>
     <w:p>
@@ -418,7 +418,7 @@
           <w:sz w:val="20"/>
           <w:szCs w:val="20"/>
         </w:rPr>
-        <w:t xml:space="preserve">Classificação do Parceiro no Programa, definida pelo número de clientes de sua carteira que se enquadram no perfil de cliente da Wise Makers, descrito na cláusula 3.1.1, e registrada no Quadro de Identificação:</w:t>
+        <w:t xml:space="preserve">Classificação do Parceiro no Programa. O nível de entrada é definido pelo número de clientes de sua carteira que se enquadram no perfil de cliente da Wise Makers, descrito na cláusula 3.1.1, conforme a tabela abaixo, ajustado pela qualificação de entrada prevista nas Regras do Programa (cláusula 3.6), e é registrado no Quadro de Identificação:</w:t>
       </w:r>
     </w:p>
     <w:tbl>
@@ -802,7 +802,7 @@
           <w:sz w:val="20"/>
           <w:szCs w:val="20"/>
         </w:rPr>
-        <w:t xml:space="preserve">O nível é revisto somente quando a carteira do Parceiro mudar de tamanho ou quando uma informação nova corrigir a estimativa inicial, por confirmação escrita entre os responsáveis. A ausência de indicações, por qualquer período, não altera o nível.</w:t>
+        <w:t xml:space="preserve">A cada trimestre, a Wise Makers revê o nível do Parceiro conforme os requisitos de resultado, de capacitação e de cumprimento das regras publicados nas Regras do Programa. O Parceiro que cumprir os requisitos de um nível acima passa a ele de imediato. O Parceiro que deixar de cumprir os requisitos do seu nível é avisado por escrito e tem 1 (um) trimestre para voltar a cumpri-los; persistindo o descumprimento, o nível pode ser reduzido em um grau, por confirmação escrita da Wise Makers. A simples ausência de contato não altera o nível. O nível também é revisto quando a carteira do Parceiro mudar de tamanho ou quando uma informação nova corrigir a estimativa inicial, por confirmação escrita entre os responsáveis.</w:t>
       </w:r>
     </w:p>
     <w:p>
@@ -1349,7 +1349,44 @@
           <w:sz w:val="20"/>
           <w:szCs w:val="20"/>
         </w:rPr>
-        <w:t xml:space="preserve">Não há redução de pacote por inatividade. As entregas contratadas permanecem válidas. O que pode ser suspenso, de comum acordo ou nas hipóteses deste Contrato, é a cadência de acompanhamento e o ciclo do Base Ativa.</w:t>
+        <w:t xml:space="preserve">O pacote não é reduzido por inatividade. Quando o nível for reduzido na forma da cláusula 3.2, o pacote passa ao maior pacote disponível para o novo nível ao fim do ciclo do Base Ativa em curso ou 30 (trinta) dias após a confirmação, o que ocorrer por último. As entregas já realizadas permanecem válidas. O que pode ser suspenso, de comum acordo ou nas hipóteses deste Contrato, é a cadência de acompanhamento e o ciclo do Base Ativa.</w:t>
+      </w:r>
+    </w:p>
+    <w:p>
+      <w:pPr>
+        <w:spacing w:after="100" w:line="276"/>
+        <w:jc w:val="both"/>
+      </w:pPr>
+      <w:r>
+        <w:rPr>
+          <w:rFonts w:ascii="Calibri" w:cs="Calibri" w:eastAsia="Calibri" w:hAnsi="Calibri"/>
+          <w:b/>
+          <w:bCs/>
+          <w:color w:val="111111"/>
+          <w:sz w:val="20"/>
+          <w:szCs w:val="20"/>
+        </w:rPr>
+        <w:t xml:space="preserve">3.6  </w:t>
+      </w:r>
+      <w:r>
+        <w:rPr>
+          <w:rFonts w:ascii="Calibri" w:cs="Calibri" w:eastAsia="Calibri" w:hAnsi="Calibri"/>
+          <w:b/>
+          <w:bCs/>
+          <w:color w:val="111111"/>
+          <w:sz w:val="20"/>
+          <w:szCs w:val="20"/>
+        </w:rPr>
+        <w:t xml:space="preserve">Regras do Programa. </w:t>
+      </w:r>
+      <w:r>
+        <w:rPr>
+          <w:rFonts w:ascii="Calibri" w:cs="Calibri" w:eastAsia="Calibri" w:hAnsi="Calibri"/>
+          <w:color w:val="111111"/>
+          <w:sz w:val="20"/>
+          <w:szCs w:val="20"/>
+        </w:rPr>
+        <w:t xml:space="preserve">Os requisitos de nível, a qualificação de entrada, a régua de acompanhamento, os prazos de resposta às indicações e os critérios de encerramento por inatividade são publicados nas Regras do Programa, no Portal Wise Partners, e integram este Contrato. A Wise Makers pode atualizá-los mediante aviso no Portal com 30 (trinta) dias de antecedência, sem alterar as comissões das cláusulas 7 e 8 nem as entregas já realizadas.</w:t>
       </w:r>
     </w:p>
     <w:p>
@@ -3867,7 +3904,7 @@
           <w:sz w:val="20"/>
           <w:szCs w:val="20"/>
         </w:rPr>
-        <w:t xml:space="preserve">Não há meta de indicação, volume mínimo, exclusividade, mensalidade ou contrapartida financeira de qualquer natureza a cargo do Parceiro.</w:t>
+        <w:t xml:space="preserve">Não há meta obrigatória de indicação, volume mínimo, exclusividade, mensalidade ou contrapartida financeira de qualquer natureza a cargo do Parceiro. Os resultados do Parceiro influenciam apenas o seu nível, na forma da cláusula 3.2, e o critério da cláusula 13.3.</w:t>
       </w:r>
     </w:p>
     <w:p>
@@ -4221,7 +4258,7 @@
           <w:sz w:val="20"/>
           <w:szCs w:val="20"/>
         </w:rPr>
-        <w:t xml:space="preserve">Considera-se originado pelo Parceiro o cliente cujo primeiro contato registrado com a Wise Makers tenha origem identificada no Parceiro, inclusive por indicação nominal no grupo de comunicação direta, cuja mensagem constitui o registro de origem, ou por cadastro na página do Parceiro no Wise Hub. Em caso de divergência, prevalece o primeiro registro.</w:t>
+        <w:t xml:space="preserve">Considera-se originado pelo Parceiro o cliente cujo primeiro contato registrado com a Wise Makers tenha origem identificada no Parceiro, inclusive por indicação nominal no grupo de comunicação direta, cuja mensagem constitui o registro de origem, por cadastro na página do Parceiro no Wise Hub, ou por envio do formulário do link exclusivo de indicação do Parceiro no Portal Wise Partners. Em caso de divergência, prevalece o primeiro registro.</w:t>
       </w:r>
     </w:p>
     <w:p>
@@ -4247,7 +4284,7 @@
           <w:sz w:val="20"/>
           <w:szCs w:val="20"/>
         </w:rPr>
-        <w:t xml:space="preserve">Quando um contato sem interação com a Wise Makers há 6 (seis) meses ou mais for reengajado por outro parceiro do Programa, a Wise Makers pode atribuir a indicação a quem o reengajou, mediante justificativa registrada e comunicada ao Parceiro.</w:t>
+        <w:t xml:space="preserve">A indicação fica protegida por 180 (cento e oitenta) dias contados da última interação registrada entre a Wise Makers e o cliente. Passado esse prazo sem interação, o cliente reengajado por outro parceiro do Programa é atribuído a quem o reengajou, com aviso ao Parceiro que fez o primeiro registro.</w:t>
       </w:r>
     </w:p>
     <w:p>
@@ -4274,6 +4311,43 @@
           <w:szCs w:val="20"/>
         </w:rPr>
         <w:t xml:space="preserve">Às indicações feitas pela Wise Makers ao Parceiro aplicam-se as regras de atribuição do instrumento do Parceiro, quando houver, e, na falta dele, a regra do primeiro registro da cláusula 9.1.</w:t>
+      </w:r>
+    </w:p>
+    <w:p>
+      <w:pPr>
+        <w:spacing w:after="100" w:line="276"/>
+        <w:jc w:val="both"/>
+      </w:pPr>
+      <w:r>
+        <w:rPr>
+          <w:rFonts w:ascii="Calibri" w:cs="Calibri" w:eastAsia="Calibri" w:hAnsi="Calibri"/>
+          <w:b/>
+          <w:bCs/>
+          <w:color w:val="111111"/>
+          <w:sz w:val="20"/>
+          <w:szCs w:val="20"/>
+        </w:rPr>
+        <w:t xml:space="preserve">9.4  </w:t>
+      </w:r>
+      <w:r>
+        <w:rPr>
+          <w:rFonts w:ascii="Calibri" w:cs="Calibri" w:eastAsia="Calibri" w:hAnsi="Calibri"/>
+          <w:b/>
+          <w:bCs/>
+          <w:color w:val="111111"/>
+          <w:sz w:val="20"/>
+          <w:szCs w:val="20"/>
+        </w:rPr>
+        <w:t xml:space="preserve">Prazos de resposta. </w:t>
+      </w:r>
+      <w:r>
+        <w:rPr>
+          <w:rFonts w:ascii="Calibri" w:cs="Calibri" w:eastAsia="Calibri" w:hAnsi="Calibri"/>
+          <w:color w:val="111111"/>
+          <w:sz w:val="20"/>
+          <w:szCs w:val="20"/>
+        </w:rPr>
+        <w:t xml:space="preserve">A Wise Makers se compromete a validar a indicação e fazer o primeiro contato com o cliente em até 2 (dois) dias úteis, dar retorno ao Parceiro em até 5 (cinco) dias úteis do registro e manter a indicação atualizada no Portal. O Parceiro observa os mesmos prazos de primeiro contato e de atualização nas indicações que receber da Wise Makers. Os prazos são obrigação de meio, podem ser ajustados nas Regras do Programa e o seu descumprimento não gera multa nem altera comissões.</w:t>
       </w:r>
     </w:p>
     <w:p>
@@ -4316,7 +4390,7 @@
           <w:sz w:val="20"/>
           <w:szCs w:val="20"/>
         </w:rPr>
-        <w:t xml:space="preserve">A Wise Makers não recebe do Parceiro listas ou bases de clientes. O Parceiro convida a sua carteira, e se cadastra quem decide se cadastrar.</w:t>
+        <w:t xml:space="preserve">A Wise Makers não recebe do Parceiro listas ou bases de clientes, ressalvado o cruzamento de carteiras da cláusula 10.4. O Parceiro convida a sua carteira, e se cadastra quem decide se cadastrar.</w:t>
       </w:r>
     </w:p>
     <w:p>
@@ -4369,6 +4443,43 @@
           <w:szCs w:val="20"/>
         </w:rPr>
         <w:t xml:space="preserve">As partes observam a Lei nº 13.709/2018 (LGPD) no tratamento de dados pessoais decorrente desta parceria.</w:t>
+      </w:r>
+    </w:p>
+    <w:p>
+      <w:pPr>
+        <w:spacing w:after="100" w:line="276"/>
+        <w:jc w:val="both"/>
+      </w:pPr>
+      <w:r>
+        <w:rPr>
+          <w:rFonts w:ascii="Calibri" w:cs="Calibri" w:eastAsia="Calibri" w:hAnsi="Calibri"/>
+          <w:b/>
+          <w:bCs/>
+          <w:color w:val="111111"/>
+          <w:sz w:val="20"/>
+          <w:szCs w:val="20"/>
+        </w:rPr>
+        <w:t xml:space="preserve">10.4  </w:t>
+      </w:r>
+      <w:r>
+        <w:rPr>
+          <w:rFonts w:ascii="Calibri" w:cs="Calibri" w:eastAsia="Calibri" w:hAnsi="Calibri"/>
+          <w:b/>
+          <w:bCs/>
+          <w:color w:val="111111"/>
+          <w:sz w:val="20"/>
+          <w:szCs w:val="20"/>
+        </w:rPr>
+        <w:t xml:space="preserve">Cruzamento de carteiras. </w:t>
+      </w:r>
+      <w:r>
+        <w:rPr>
+          <w:rFonts w:ascii="Calibri" w:cs="Calibri" w:eastAsia="Calibri" w:hAnsi="Calibri"/>
+          <w:color w:val="111111"/>
+          <w:sz w:val="20"/>
+          <w:szCs w:val="20"/>
+        </w:rPr>
+        <w:t xml:space="preserve">O Parceiro pode, a seu critério e mediante aceite específico no Portal a cada uso, comparar a sua carteira com a da Wise Makers para identificar oportunidades em comum. O cruzamento usa exclusivamente o número de inscrição no CNPJ de pessoas jurídicas, sem qualquer dado pessoal. A lista do Parceiro é processada e descartada no mesmo ato, sem armazenamento, e ficam registradas apenas as coincidências, por até 180 (cento e oitenta) dias, salvo as que se converterem em indicação ou ação conjunta. O Parceiro vê os totais por tipo de coincidência. Nenhuma das partes abordará cliente da outra em nome da parceria sem acordo prévio, caso a caso. O Parceiro pode pedir a exclusão das coincidências a qualquer tempo, atendida de imediato.</w:t>
       </w:r>
     </w:p>
     <w:p>
@@ -4590,7 +4701,7 @@
           <w:sz w:val="20"/>
           <w:szCs w:val="20"/>
         </w:rPr>
-        <w:t xml:space="preserve">A ausência de indicações, por qualquer período, não encerra este Contrato.</w:t>
+        <w:t xml:space="preserve">A ausência de indicações, por si só, não encerra este Contrato. A Wise Makers pode encerrá-lo, com o aviso da cláusula 13.4, quando o Parceiro, assinado há 180 (cento e oitenta) dias ou mais, permanecer por 180 (cento e oitenta) dias sem indicação qualificada e sem contrapartida comprovada, depois de 2 (duas) tentativas de retomada registradas e comunicadas por escrito, conforme as Regras do Programa. Durante a pausa da cláusula 13.2, esse prazo não corre.</w:t>
       </w:r>
     </w:p>
     <w:p>
@@ -4749,7 +4860,7 @@
           <w:sz w:val="20"/>
           <w:szCs w:val="20"/>
         </w:rPr>
-        <w:t xml:space="preserve">Alterações deste Contrato somente por escrito, assinadas pelas duas partes, ressalvadas as confirmações escritas previstas nas cláusulas 3.2, 3.4, 4.8.2 e 13.2.</w:t>
+        <w:t xml:space="preserve">Alterações deste Contrato somente por escrito, assinadas pelas duas partes, ressalvadas as confirmações escritas previstas nas cláusulas 3.2, 3.4, 3.5, 4.8.2 e 13.2 e as atualizações das Regras do Programa na forma da cláusula 3.6.</w:t>
       </w:r>
     </w:p>
     <w:p>
@@ -6051,7 +6162,7 @@
         <w:sz w:val="15"/>
         <w:szCs w:val="15"/>
       </w:rPr>
-      <w:t xml:space="preserve">Wise Partners · Contrato de Parceria Comercial  ·  página </w:t>
+      <w:t xml:space="preserve">Wise Partners · Contrato de Parceria Comercial · Versão 2  ·  página </w:t>
     </w:r>
     <w:r>
       <w:rPr>

</xml_diff>